<commit_message>
added acronyms to CV and republished
</commit_message>
<xml_diff>
--- a/CV_word.docx
+++ b/CV_word.docx
@@ -136,7 +136,55 @@
         <w:t xml:space="preserve">: </w:t>
       </w:r>
       <w:r>
-        <w:t>Statistical Methods, Machine Learning, Bayesian Optimization, Adaptive Experimental Design, Deep Learning, Neural Networks, Transformers, Natural Language Processing, Large Language Models, Computer Vision, Reinforcement Learning, Decision Trees, Predictive Analytics, Time Series Analysis, Numerical Optimization, Hypothesis Testing, Causal Inference, Network Science, Data Science, Artificial Intelligence, Numerical Methods</w:t>
+        <w:t>Statistical Methods, Machine Learning</w:t>
+      </w:r>
+      <w:r>
+        <w:t xml:space="preserve"> (ML)</w:t>
+      </w:r>
+      <w:r>
+        <w:t>, Bayesian Optimization, Adaptive Experimental Design</w:t>
+      </w:r>
+      <w:r>
+        <w:t xml:space="preserve"> (AE)</w:t>
+      </w:r>
+      <w:r>
+        <w:t>, Deep Learning, Neural Networks</w:t>
+      </w:r>
+      <w:r>
+        <w:t xml:space="preserve"> (NN)</w:t>
+      </w:r>
+      <w:r>
+        <w:t>, Transformers, Natural Language Processing</w:t>
+      </w:r>
+      <w:r>
+        <w:t xml:space="preserve"> (NLP)</w:t>
+      </w:r>
+      <w:r>
+        <w:t>, Large Language Models</w:t>
+      </w:r>
+      <w:r>
+        <w:t xml:space="preserve"> (LLM)</w:t>
+      </w:r>
+      <w:r>
+        <w:t>, Computer Vision</w:t>
+      </w:r>
+      <w:r>
+        <w:t xml:space="preserve"> (CV)</w:t>
+      </w:r>
+      <w:r>
+        <w:t>, Reinforcement Learning</w:t>
+      </w:r>
+      <w:r>
+        <w:t xml:space="preserve"> (RL)</w:t>
+      </w:r>
+      <w:r>
+        <w:t>, Decision Trees, Predictive Analytics, Time Series Analysis, Numerical Optimization, Hypothesis Testing, Causal Inference, Network Science, Data Science, Artificial Intelligence</w:t>
+      </w:r>
+      <w:r>
+        <w:t xml:space="preserve"> (AI)</w:t>
+      </w:r>
+      <w:r>
+        <w:t>, Numerical Methods</w:t>
       </w:r>
     </w:p>
     <w:p>
@@ -187,14 +235,24 @@
       <w:r>
         <w:t xml:space="preserve"> </w:t>
       </w:r>
+      <w:proofErr w:type="spellStart"/>
       <w:r>
-        <w:t>PyTorch,</w:t>
+        <w:t>PyTorch</w:t>
+      </w:r>
+      <w:proofErr w:type="spellEnd"/>
+      <w:r>
+        <w:t>,</w:t>
       </w:r>
       <w:r>
         <w:t xml:space="preserve"> </w:t>
       </w:r>
+      <w:proofErr w:type="spellStart"/>
       <w:r>
-        <w:t>BoTorch,</w:t>
+        <w:t>BoTorch</w:t>
+      </w:r>
+      <w:proofErr w:type="spellEnd"/>
+      <w:r>
+        <w:t>,</w:t>
       </w:r>
       <w:r>
         <w:t xml:space="preserve"> </w:t>
@@ -299,7 +357,39 @@
           <w:caps w:val="0"/>
           <w:szCs w:val="22"/>
         </w:rPr>
-        <w:t>Discovered optimized recipes for testing obtained using machine learning techniques like Bayesian optimization and reinforcement learning that resulted in $10 million annual savings for the organization.</w:t>
+        <w:t xml:space="preserve">Discovered optimized recipes for testing obtained using </w:t>
+      </w:r>
+      <w:r>
+        <w:rPr>
+          <w:rFonts w:eastAsiaTheme="minorHAnsi" w:cstheme="minorBidi"/>
+          <w:caps w:val="0"/>
+          <w:szCs w:val="22"/>
+        </w:rPr>
+        <w:t xml:space="preserve">ML </w:t>
+      </w:r>
+      <w:r>
+        <w:rPr>
+          <w:rFonts w:eastAsiaTheme="minorHAnsi" w:cstheme="minorBidi"/>
+          <w:caps w:val="0"/>
+          <w:szCs w:val="22"/>
+        </w:rPr>
+        <w:t xml:space="preserve">techniques like </w:t>
+      </w:r>
+      <w:r>
+        <w:rPr>
+          <w:rFonts w:eastAsiaTheme="minorHAnsi" w:cstheme="minorBidi"/>
+          <w:caps w:val="0"/>
+          <w:szCs w:val="22"/>
+        </w:rPr>
+        <w:t xml:space="preserve">adaptive experimentation, </w:t>
+      </w:r>
+      <w:r>
+        <w:rPr>
+          <w:rFonts w:eastAsiaTheme="minorHAnsi" w:cstheme="minorBidi"/>
+          <w:caps w:val="0"/>
+          <w:szCs w:val="22"/>
+        </w:rPr>
+        <w:t>Bayesian optimization and reinforcement learning that resulted in $10 million annual savings for the organization.</w:t>
       </w:r>
     </w:p>
     <w:p>
@@ -316,7 +406,23 @@
           <w:caps w:val="0"/>
           <w:szCs w:val="22"/>
         </w:rPr>
-        <w:t xml:space="preserve">Developed an internal production-ready machine learning and AI software platform in collaboration with a small team. </w:t>
+        <w:t xml:space="preserve">Developed an internal production-ready </w:t>
+      </w:r>
+      <w:r>
+        <w:rPr>
+          <w:rFonts w:eastAsiaTheme="minorHAnsi" w:cstheme="minorBidi"/>
+          <w:caps w:val="0"/>
+          <w:szCs w:val="22"/>
+        </w:rPr>
+        <w:t>ML</w:t>
+      </w:r>
+      <w:r>
+        <w:rPr>
+          <w:rFonts w:eastAsiaTheme="minorHAnsi" w:cstheme="minorBidi"/>
+          <w:caps w:val="0"/>
+          <w:szCs w:val="22"/>
+        </w:rPr>
+        <w:t xml:space="preserve"> and AI software platform in collaboration with a small team. </w:t>
       </w:r>
     </w:p>
     <w:p>
@@ -521,7 +627,23 @@
           <w:caps w:val="0"/>
           <w:szCs w:val="22"/>
         </w:rPr>
-        <w:t>Applied modern data science and machine learning techniques to data sets with thousands of entries in health, economics, marketing, and physics to gain insights.</w:t>
+        <w:t xml:space="preserve">Applied modern data science and </w:t>
+      </w:r>
+      <w:r>
+        <w:rPr>
+          <w:rFonts w:eastAsiaTheme="minorHAnsi" w:cstheme="minorBidi"/>
+          <w:caps w:val="0"/>
+          <w:szCs w:val="22"/>
+        </w:rPr>
+        <w:t xml:space="preserve">ML </w:t>
+      </w:r>
+      <w:r>
+        <w:rPr>
+          <w:rFonts w:eastAsiaTheme="minorHAnsi" w:cstheme="minorBidi"/>
+          <w:caps w:val="0"/>
+          <w:szCs w:val="22"/>
+        </w:rPr>
+        <w:t>techniques to data sets with thousands of entries in health, economics, marketing, and physics to gain insights.</w:t>
       </w:r>
     </w:p>
     <w:p>
@@ -538,7 +660,55 @@
           <w:caps w:val="0"/>
           <w:szCs w:val="22"/>
         </w:rPr>
-        <w:t>Worked with simple neural networks, convolutional neural networks, recurrent neural networks, gradient boosted trees, and random forest.</w:t>
+        <w:t>Worked with simple neural networks, convolutional neural networks</w:t>
+      </w:r>
+      <w:r>
+        <w:rPr>
+          <w:rFonts w:eastAsiaTheme="minorHAnsi" w:cstheme="minorBidi"/>
+          <w:caps w:val="0"/>
+          <w:szCs w:val="22"/>
+        </w:rPr>
+        <w:t xml:space="preserve"> (CNN)</w:t>
+      </w:r>
+      <w:r>
+        <w:rPr>
+          <w:rFonts w:eastAsiaTheme="minorHAnsi" w:cstheme="minorBidi"/>
+          <w:caps w:val="0"/>
+          <w:szCs w:val="22"/>
+        </w:rPr>
+        <w:t>, recurrent neural networks</w:t>
+      </w:r>
+      <w:r>
+        <w:rPr>
+          <w:rFonts w:eastAsiaTheme="minorHAnsi" w:cstheme="minorBidi"/>
+          <w:caps w:val="0"/>
+          <w:szCs w:val="22"/>
+        </w:rPr>
+        <w:t xml:space="preserve"> (RNN)</w:t>
+      </w:r>
+      <w:r>
+        <w:rPr>
+          <w:rFonts w:eastAsiaTheme="minorHAnsi" w:cstheme="minorBidi"/>
+          <w:caps w:val="0"/>
+          <w:szCs w:val="22"/>
+        </w:rPr>
+        <w:t>, gradient boosted trees, and random forest</w:t>
+      </w:r>
+      <w:r>
+        <w:rPr>
+          <w:rFonts w:eastAsiaTheme="minorHAnsi" w:cstheme="minorBidi"/>
+          <w:caps w:val="0"/>
+          <w:szCs w:val="22"/>
+        </w:rPr>
+        <w:t xml:space="preserve"> (RF)</w:t>
+      </w:r>
+      <w:r>
+        <w:rPr>
+          <w:rFonts w:eastAsiaTheme="minorHAnsi" w:cstheme="minorBidi"/>
+          <w:caps w:val="0"/>
+          <w:szCs w:val="22"/>
+        </w:rPr>
+        <w:t>.</w:t>
       </w:r>
     </w:p>
     <w:p>
@@ -711,7 +881,25 @@
           <w:caps w:val="0"/>
           <w:szCs w:val="22"/>
         </w:rPr>
-        <w:t>persistent homology to detect topological signatures in in very large (105 time steps) time-series of flow patterns consisting of 106 pixels</w:t>
+        <w:t>persistent homology to detect topological signatures in in very large (</w:t>
+      </w:r>
+      <w:proofErr w:type="gramStart"/>
+      <w:r>
+        <w:rPr>
+          <w:rFonts w:eastAsiaTheme="minorHAnsi" w:cstheme="minorBidi"/>
+          <w:caps w:val="0"/>
+          <w:szCs w:val="22"/>
+        </w:rPr>
+        <w:t>105 time</w:t>
+      </w:r>
+      <w:proofErr w:type="gramEnd"/>
+      <w:r>
+        <w:rPr>
+          <w:rFonts w:eastAsiaTheme="minorHAnsi" w:cstheme="minorBidi"/>
+          <w:caps w:val="0"/>
+          <w:szCs w:val="22"/>
+        </w:rPr>
+        <w:t xml:space="preserve"> steps) time-series of flow patterns consisting of 106 pixels</w:t>
       </w:r>
     </w:p>
     <w:p>
@@ -930,7 +1118,15 @@
         <w:t>Tregoning, B.</w:t>
       </w:r>
       <w:r>
-        <w:t>, Barnett, J., Yoda, M., &amp; Grigoriev, R. (2019). Experimental Study of Roll-Hydrothermal Wave Coexistence in Convection Driven by Buoyancy and Thermocapillarity, In 72nd Annual Meeting of the APS Division of Fluid Dynamics (APS DFD 2019), Seattle, Washington, USA.</w:t>
+        <w:t xml:space="preserve">, Barnett, J., Yoda, M., &amp; Grigoriev, R. (2019). Experimental Study of Roll-Hydrothermal Wave Coexistence in Convection Driven by Buoyancy and </w:t>
+      </w:r>
+      <w:proofErr w:type="spellStart"/>
+      <w:r>
+        <w:t>Thermocapillarity</w:t>
+      </w:r>
+      <w:proofErr w:type="spellEnd"/>
+      <w:r>
+        <w:t>, In 72nd Annual Meeting of the APS Division of Fluid Dynamics (APS DFD 2019), Seattle, Washington, USA.</w:t>
       </w:r>
       <w:r>
         <w:t xml:space="preserve"> </w:t>
@@ -948,7 +1144,15 @@
         <w:t>Tregoning, B.</w:t>
       </w:r>
       <w:r>
-        <w:t>, Mukherjee, S., Levanger, R., Cyranka, J., Mischaikow, K., Paul, M., &amp; Schatz, M. (2019). Characterizing Spatiotemporal Dynamics in Fluid Flows using Persistent Homology, In Invited Seminar at Los Alamos National Labs, Los Alamos, New Mexico, USA.</w:t>
+        <w:t xml:space="preserve">, Mukherjee, S., Levanger, R., </w:t>
+      </w:r>
+      <w:proofErr w:type="spellStart"/>
+      <w:r>
+        <w:t>Cyranka</w:t>
+      </w:r>
+      <w:proofErr w:type="spellEnd"/>
+      <w:r>
+        <w:t>, J., Mischaikow, K., Paul, M., &amp; Schatz, M. (2019). Characterizing Spatiotemporal Dynamics in Fluid Flows using Persistent Homology, In Invited Seminar at Los Alamos National Labs, Los Alamos, New Mexico, USA.</w:t>
       </w:r>
       <w:r>
         <w:t xml:space="preserve"> </w:t>
@@ -969,7 +1173,15 @@
         <w:t xml:space="preserve"> </w:t>
       </w:r>
       <w:r>
-        <w:t xml:space="preserve">Mukherjee, S., Levanger, R., Xu, M., Cyranka, J., Mischaikow, K., Paul, M., &amp; Schatz, M. (2019). Using Persistent Homology to Compare Chaotic Dynamics Between Experiments on and Simulations of Rayleigh-Bénard </w:t>
+        <w:t xml:space="preserve">Mukherjee, S., Levanger, R., Xu, M., </w:t>
+      </w:r>
+      <w:proofErr w:type="spellStart"/>
+      <w:r>
+        <w:t>Cyranka</w:t>
+      </w:r>
+      <w:proofErr w:type="spellEnd"/>
+      <w:r>
+        <w:t xml:space="preserve">, J., Mischaikow, K., Paul, M., &amp; Schatz, M. (2019). Using Persistent Homology to Compare Chaotic Dynamics Between Experiments on and Simulations of Rayleigh-Bénard </w:t>
       </w:r>
       <w:r>
         <w:lastRenderedPageBreak/>
@@ -991,7 +1203,15 @@
         <w:t>Tregoning, B.</w:t>
       </w:r>
       <w:r>
-        <w:t>, Levanger, R., Cyranka, J., Mukherjee, S., Paul, M., Mischaikow, K., &amp; Schatz, M. (2018). Using topology to identify large Lyapunov vector magnitude in Rayleigh-Bénard convection, In 71st Annual Meeting of the APS Division of Fluid Dynamics (APS DFD 2018), Atlanta, Georgia, USA.</w:t>
+        <w:t xml:space="preserve">, Levanger, R., </w:t>
+      </w:r>
+      <w:proofErr w:type="spellStart"/>
+      <w:r>
+        <w:t>Cyranka</w:t>
+      </w:r>
+      <w:proofErr w:type="spellEnd"/>
+      <w:r>
+        <w:t>, J., Mukherjee, S., Paul, M., Mischaikow, K., &amp; Schatz, M. (2018). Using topology to identify large Lyapunov vector magnitude in Rayleigh-Bénard convection, In 71st Annual Meeting of the APS Division of Fluid Dynamics (APS DFD 2018), Atlanta, Georgia, USA.</w:t>
       </w:r>
       <w:r>
         <w:t xml:space="preserve"> </w:t>

</xml_diff>